<commit_message>
I updated the journal
I got movement working
</commit_message>
<xml_diff>
--- a/NASA VR Journal.docx
+++ b/NASA VR Journal.docx
@@ -793,6 +793,9 @@
       <w:r>
         <w:t>Maybe a simple task</w:t>
       </w:r>
+      <w:r>
+        <w:t xml:space="preserve"> – Walking around</w:t>
+      </w:r>
     </w:p>
     <w:p>
       <w:pPr>
@@ -818,19 +821,127 @@
         </w:rPr>
         <w:t xml:space="preserve"> Nov. 1</w:t>
       </w:r>
-    </w:p>
-    <w:p>
-      <w:pPr>
+      <w:r>
         <w:rPr>
           <w:color w:val="EE0000"/>
         </w:rPr>
-      </w:pPr>
-      <w:r>
+        <w:t xml:space="preserve"> </w:t>
+      </w:r>
+    </w:p>
+    <w:p>
+      <w:pPr>
         <w:rPr>
           <w:color w:val="EE0000"/>
         </w:rPr>
+      </w:pPr>
+      <w:r>
+        <w:rPr>
+          <w:color w:val="EE0000"/>
+        </w:rPr>
         <w:tab/>
-        <w:t>Working to remake area and script objects to get a working area.</w:t>
+        <w:t xml:space="preserve">Working to remake area and script objects to </w:t>
+      </w:r>
+      <w:r>
+        <w:rPr>
+          <w:color w:val="EE0000"/>
+        </w:rPr>
+        <w:t>get to</w:t>
+      </w:r>
+      <w:r>
+        <w:rPr>
+          <w:color w:val="EE0000"/>
+        </w:rPr>
+        <w:t xml:space="preserve"> a working area.</w:t>
+      </w:r>
+    </w:p>
+    <w:p>
+      <w:pPr>
+        <w:rPr>
+          <w:color w:val="4EA72E" w:themeColor="accent6"/>
+        </w:rPr>
+      </w:pPr>
+      <w:r>
+        <w:rPr>
+          <w:color w:val="4EA72E" w:themeColor="accent6"/>
+        </w:rPr>
+        <w:t xml:space="preserve">FIXED – Nov </w:t>
+      </w:r>
+      <w:r>
+        <w:rPr>
+          <w:color w:val="4EA72E" w:themeColor="accent6"/>
+        </w:rPr>
+        <w:t>6</w:t>
+      </w:r>
+    </w:p>
+    <w:p>
+      <w:pPr>
+        <w:rPr>
+          <w:color w:val="4EA72E" w:themeColor="accent6"/>
+        </w:rPr>
+      </w:pPr>
+      <w:r>
+        <w:rPr>
+          <w:color w:val="4EA72E" w:themeColor="accent6"/>
+        </w:rPr>
+        <w:tab/>
+        <w:t>Rewrote the program got things working</w:t>
+      </w:r>
+    </w:p>
+    <w:p>
+      <w:r>
+        <w:t>Live demo of area for Bill and Shara Nov 7,</w:t>
+      </w:r>
+    </w:p>
+    <w:p>
+      <w:pPr>
+        <w:pStyle w:val="ListParagraph"/>
+        <w:numPr>
+          <w:ilvl w:val="0"/>
+          <w:numId w:val="1"/>
+        </w:numPr>
+      </w:pPr>
+      <w:r>
+        <w:t>Got the locomotive system in just need to find the scripts for using the thumb stick controllers on the Quest.</w:t>
+      </w:r>
+      <w:r>
+        <w:t xml:space="preserve"> – Nov</w:t>
+      </w:r>
+      <w:r>
+        <w:t xml:space="preserve"> 16</w:t>
+      </w:r>
+    </w:p>
+    <w:p>
+      <w:r>
+        <w:t xml:space="preserve">Made a Web based version to be used on the web it is now on GitHub </w:t>
+      </w:r>
+      <w:r>
+        <w:t>–</w:t>
+      </w:r>
+      <w:r>
+        <w:t xml:space="preserve"> </w:t>
+      </w:r>
+      <w:r>
+        <w:t>16</w:t>
+      </w:r>
+    </w:p>
+    <w:p>
+      <w:r>
+        <w:t>I got an early version of the movement for the moon environment done I will begin working on making the player</w:t>
+      </w:r>
+      <w:r>
+        <w:t>’s movement based on the gravity – Nov. 20</w:t>
+      </w:r>
+    </w:p>
+    <w:p>
+      <w:pPr>
+        <w:pStyle w:val="ListParagraph"/>
+        <w:numPr>
+          <w:ilvl w:val="0"/>
+          <w:numId w:val="2"/>
+        </w:numPr>
+      </w:pPr>
+      <w:r>
+        <w:t>I had to use different commands from the one online I think that I have a newer version of unity that I am working with.</w:t>
       </w:r>
     </w:p>
     <w:p/>
@@ -1010,6 +1121,119 @@
 <file path=word/numbering.xml><?xml version="1.0" encoding="utf-8"?>
 <w:numbering xmlns:wpc="http://schemas.microsoft.com/office/word/2010/wordprocessingCanvas" xmlns:cx="http://schemas.microsoft.com/office/drawing/2014/chartex" xmlns:cx1="http://schemas.microsoft.com/office/drawing/2015/9/8/chartex" xmlns:cx2="http://schemas.microsoft.com/office/drawing/2015/10/21/chartex" xmlns:cx3="http://schemas.microsoft.com/office/drawing/2016/5/9/chartex" xmlns:cx4="http://schemas.microsoft.com/office/drawing/2016/5/10/chartex" xmlns:cx5="http://schemas.microsoft.com/office/drawing/2016/5/11/chartex" xmlns:cx6="http://schemas.microsoft.com/office/drawing/2016/5/12/chartex" xmlns:cx7="http://schemas.microsoft.com/office/drawing/2016/5/13/chartex" xmlns:cx8="http://schemas.microsoft.com/office/drawing/2016/5/14/chartex" xmlns:mc="http://schemas.openxmlformats.org/markup-compatibility/2006" xmlns:aink="http://schemas.microsoft.com/office/drawing/2016/ink" xmlns:am3d="http://schemas.microsoft.com/office/drawing/2017/model3d" xmlns:o="urn:schemas-microsoft-com:office:office" xmlns:oel="http://schemas.microsoft.com/office/2019/extlst" xmlns:r="http://schemas.openxmlformats.org/officeDocument/2006/relationships" xmlns:m="http://schemas.openxmlformats.org/officeDocument/2006/math" xmlns:v="urn:schemas-microsoft-com:vml" xmlns:wp14="http://schemas.microsoft.com/office/word/2010/wordprocessingDrawing" xmlns:wp="http://schemas.openxmlformats.org/drawingml/2006/wordprocessingDrawing" xmlns:w10="urn:schemas-microsoft-com:office:word" xmlns:w="http://schemas.openxmlformats.org/wordprocessingml/2006/main" xmlns:w14="http://schemas.microsoft.com/office/word/2010/wordml" xmlns:w15="http://schemas.microsoft.com/office/word/2012/wordml" xmlns:w16cex="http://schemas.microsoft.com/office/word/2018/wordml/cex" xmlns:w16cid="http://schemas.microsoft.com/office/word/2016/wordml/cid" xmlns:w16="http://schemas.microsoft.com/office/word/2018/wordml" xmlns:w16du="http://schemas.microsoft.com/office/word/2023/wordml/word16du" xmlns:w16sdtdh="http://schemas.microsoft.com/office/word/2020/wordml/sdtdatahash" xmlns:w16sdtfl="http://schemas.microsoft.com/office/word/2024/wordml/sdtformatlock" xmlns:w16se="http://schemas.microsoft.com/office/word/2015/wordml/symex" xmlns:wpg="http://schemas.microsoft.com/office/word/2010/wordprocessingGroup" xmlns:wpi="http://schemas.microsoft.com/office/word/2010/wordprocessingInk" xmlns:wne="http://schemas.microsoft.com/office/word/2006/wordml" xmlns:wps="http://schemas.microsoft.com/office/word/2010/wordprocessingShape" mc:Ignorable="w14 w15 w16se w16cid w16 w16cex w16sdtdh w16sdtfl w16du wp14">
   <w:abstractNum w:abstractNumId="0" w15:restartNumberingAfterBreak="0">
+    <w:nsid w:val="181D4C69"/>
+    <w:multiLevelType w:val="hybridMultilevel"/>
+    <w:tmpl w:val="3A66A8E4"/>
+    <w:lvl w:ilvl="0" w:tplc="04090001">
+      <w:start w:val="1"/>
+      <w:numFmt w:val="bullet"/>
+      <w:lvlText w:val=""/>
+      <w:lvlJc w:val="left"/>
+      <w:pPr>
+        <w:ind w:left="720" w:hanging="360"/>
+      </w:pPr>
+      <w:rPr>
+        <w:rFonts w:ascii="Symbol" w:hAnsi="Symbol" w:hint="default"/>
+      </w:rPr>
+    </w:lvl>
+    <w:lvl w:ilvl="1" w:tplc="04090003" w:tentative="1">
+      <w:start w:val="1"/>
+      <w:numFmt w:val="bullet"/>
+      <w:lvlText w:val="o"/>
+      <w:lvlJc w:val="left"/>
+      <w:pPr>
+        <w:ind w:left="1440" w:hanging="360"/>
+      </w:pPr>
+      <w:rPr>
+        <w:rFonts w:ascii="Courier New" w:hAnsi="Courier New" w:cs="Courier New" w:hint="default"/>
+      </w:rPr>
+    </w:lvl>
+    <w:lvl w:ilvl="2" w:tplc="04090005" w:tentative="1">
+      <w:start w:val="1"/>
+      <w:numFmt w:val="bullet"/>
+      <w:lvlText w:val=""/>
+      <w:lvlJc w:val="left"/>
+      <w:pPr>
+        <w:ind w:left="2160" w:hanging="360"/>
+      </w:pPr>
+      <w:rPr>
+        <w:rFonts w:ascii="Wingdings" w:hAnsi="Wingdings" w:hint="default"/>
+      </w:rPr>
+    </w:lvl>
+    <w:lvl w:ilvl="3" w:tplc="04090001" w:tentative="1">
+      <w:start w:val="1"/>
+      <w:numFmt w:val="bullet"/>
+      <w:lvlText w:val=""/>
+      <w:lvlJc w:val="left"/>
+      <w:pPr>
+        <w:ind w:left="2880" w:hanging="360"/>
+      </w:pPr>
+      <w:rPr>
+        <w:rFonts w:ascii="Symbol" w:hAnsi="Symbol" w:hint="default"/>
+      </w:rPr>
+    </w:lvl>
+    <w:lvl w:ilvl="4" w:tplc="04090003" w:tentative="1">
+      <w:start w:val="1"/>
+      <w:numFmt w:val="bullet"/>
+      <w:lvlText w:val="o"/>
+      <w:lvlJc w:val="left"/>
+      <w:pPr>
+        <w:ind w:left="3600" w:hanging="360"/>
+      </w:pPr>
+      <w:rPr>
+        <w:rFonts w:ascii="Courier New" w:hAnsi="Courier New" w:cs="Courier New" w:hint="default"/>
+      </w:rPr>
+    </w:lvl>
+    <w:lvl w:ilvl="5" w:tplc="04090005" w:tentative="1">
+      <w:start w:val="1"/>
+      <w:numFmt w:val="bullet"/>
+      <w:lvlText w:val=""/>
+      <w:lvlJc w:val="left"/>
+      <w:pPr>
+        <w:ind w:left="4320" w:hanging="360"/>
+      </w:pPr>
+      <w:rPr>
+        <w:rFonts w:ascii="Wingdings" w:hAnsi="Wingdings" w:hint="default"/>
+      </w:rPr>
+    </w:lvl>
+    <w:lvl w:ilvl="6" w:tplc="04090001" w:tentative="1">
+      <w:start w:val="1"/>
+      <w:numFmt w:val="bullet"/>
+      <w:lvlText w:val=""/>
+      <w:lvlJc w:val="left"/>
+      <w:pPr>
+        <w:ind w:left="5040" w:hanging="360"/>
+      </w:pPr>
+      <w:rPr>
+        <w:rFonts w:ascii="Symbol" w:hAnsi="Symbol" w:hint="default"/>
+      </w:rPr>
+    </w:lvl>
+    <w:lvl w:ilvl="7" w:tplc="04090003" w:tentative="1">
+      <w:start w:val="1"/>
+      <w:numFmt w:val="bullet"/>
+      <w:lvlText w:val="o"/>
+      <w:lvlJc w:val="left"/>
+      <w:pPr>
+        <w:ind w:left="5760" w:hanging="360"/>
+      </w:pPr>
+      <w:rPr>
+        <w:rFonts w:ascii="Courier New" w:hAnsi="Courier New" w:cs="Courier New" w:hint="default"/>
+      </w:rPr>
+    </w:lvl>
+    <w:lvl w:ilvl="8" w:tplc="04090005" w:tentative="1">
+      <w:start w:val="1"/>
+      <w:numFmt w:val="bullet"/>
+      <w:lvlText w:val=""/>
+      <w:lvlJc w:val="left"/>
+      <w:pPr>
+        <w:ind w:left="6480" w:hanging="360"/>
+      </w:pPr>
+      <w:rPr>
+        <w:rFonts w:ascii="Wingdings" w:hAnsi="Wingdings" w:hint="default"/>
+      </w:rPr>
+    </w:lvl>
+  </w:abstractNum>
+  <w:abstractNum w:abstractNumId="1" w15:restartNumberingAfterBreak="0">
     <w:nsid w:val="3CD914AD"/>
     <w:multiLevelType w:val="hybridMultilevel"/>
     <w:tmpl w:val="EA0C6D62"/>
@@ -1122,6 +1346,9 @@
     </w:lvl>
   </w:abstractNum>
   <w:num w:numId="1" w16cid:durableId="633021908">
+    <w:abstractNumId w:val="1"/>
+  </w:num>
+  <w:num w:numId="2" w16cid:durableId="10840131">
     <w:abstractNumId w:val="0"/>
   </w:num>
 </w:numbering>

</xml_diff>